<commit_message>
PHY 151 LB03 rubric: five levels, matching D2L
Converts the Lab 03 rubric to Complete / Strong / Developing / Needs work /
Missing so PHY 151 and PHY 118 grade the same lab on the same granularity.
Mirrors D2L rubric 1248243, converted while it still had no assessed work.
Total unchanged at 100.

Co-Authored-By: Claude Opus 5 <noreply@anthropic.com>
Claude-Session: https://claude.ai/code/session_01BfoJCLuvP2VAH57J5mmoeL
</commit_message>
<xml_diff>
--- a/PHY151/handouts/PHY151_LB03_Rubric.docx
+++ b/PHY151/handouts/PHY151_LB03_Rubric.docx
@@ -93,6 +93,7 @@
         <w:gridCol w:w="1760"/>
         <w:gridCol w:w="1760"/>
         <w:gridCol w:w="1640"/>
+        <w:gridCol w:w="1512"/>
       </w:tblGrid>
       <w:tr>
         <w:tc>
@@ -212,7 +213,7 @@
                 <w:sz w:val="17"/>
                 <w:szCs w:val="17"/>
               </w:rPr>
-              <w:t xml:space="preserve">Nearly there</w:t>
+              <w:t>Strong</w:t>
             </w:r>
           </w:p>
         </w:tc>
@@ -242,7 +243,7 @@
                 <w:sz w:val="17"/>
                 <w:szCs w:val="17"/>
               </w:rPr>
-              <w:t xml:space="preserve">Needs work</w:t>
+              <w:t>Developing</w:t>
             </w:r>
           </w:p>
         </w:tc>
@@ -272,7 +273,17 @@
                 <w:sz w:val="17"/>
                 <w:szCs w:val="17"/>
               </w:rPr>
-              <w:t xml:space="preserve">Missing</w:t>
+              <w:t>Needs work</w:t>
+            </w:r>
+          </w:p>
+        </w:tc>
+        <w:tc>
+          <w:tcPr>
+            <w:tcW w:type="dxa" w:w="1512"/>
+          </w:tcPr>
+          <w:p>
+            <w:r>
+              <w:t>Missing</w:t>
             </w:r>
           </w:p>
         </w:tc>
@@ -362,94 +373,104 @@
                 <w:sz w:val="16"/>
                 <w:szCs w:val="16"/>
               </w:rPr>
-              <w:t xml:space="preserve">3 — Names, course and section, lab title and date, all present and correctly formatted.</w:t>
-            </w:r>
-          </w:p>
-        </w:tc>
-        <w:tc>
-          <w:tcPr>
-            <w:tcW w:type="dxa" w:w="0"/>
-            <w:tcMar>
-              <w:top w:type="dxa" w:w="60"/>
-              <w:left w:type="dxa" w:w="90"/>
-              <w:bottom w:type="dxa" w:w="60"/>
-              <w:right w:type="dxa" w:w="90"/>
-            </w:tcMar>
-          </w:tcPr>
-          <w:p>
-            <w:pPr>
-              <w:spacing w:after="0"/>
-            </w:pPr>
-            <w:r>
-              <w:rPr>
-                <w:rFonts w:ascii="Calibri" w:cs="Calibri" w:eastAsia="Calibri" w:hAnsi="Calibri"/>
-                <w:b w:val="false"/>
-                <w:bCs w:val="false"/>
-                <w:i w:val="false"/>
-                <w:iCs w:val="false"/>
-                <w:color w:val="262626"/>
-                <w:sz w:val="16"/>
-                <w:szCs w:val="16"/>
-              </w:rPr>
-              <w:t xml:space="preserve">2 — One item missing or misformatted.</w:t>
-            </w:r>
-          </w:p>
-        </w:tc>
-        <w:tc>
-          <w:tcPr>
-            <w:tcW w:type="dxa" w:w="0"/>
-            <w:tcMar>
-              <w:top w:type="dxa" w:w="60"/>
-              <w:left w:type="dxa" w:w="90"/>
-              <w:bottom w:type="dxa" w:w="60"/>
-              <w:right w:type="dxa" w:w="90"/>
-            </w:tcMar>
-          </w:tcPr>
-          <w:p>
-            <w:pPr>
-              <w:spacing w:after="0"/>
-            </w:pPr>
-            <w:r>
-              <w:rPr>
-                <w:rFonts w:ascii="Calibri" w:cs="Calibri" w:eastAsia="Calibri" w:hAnsi="Calibri"/>
-                <w:b w:val="false"/>
-                <w:bCs w:val="false"/>
-                <w:i w:val="false"/>
-                <w:iCs w:val="false"/>
-                <w:color w:val="262626"/>
-                <w:sz w:val="16"/>
-                <w:szCs w:val="16"/>
-              </w:rPr>
-              <w:t xml:space="preserve">1 — Several items missing.</w:t>
-            </w:r>
-          </w:p>
-        </w:tc>
-        <w:tc>
-          <w:tcPr>
-            <w:tcW w:type="dxa" w:w="0"/>
-            <w:tcMar>
-              <w:top w:type="dxa" w:w="60"/>
-              <w:left w:type="dxa" w:w="90"/>
-              <w:bottom w:type="dxa" w:w="60"/>
-              <w:right w:type="dxa" w:w="90"/>
-            </w:tcMar>
-          </w:tcPr>
-          <w:p>
-            <w:pPr>
-              <w:spacing w:after="0"/>
-            </w:pPr>
-            <w:r>
-              <w:rPr>
-                <w:rFonts w:ascii="Calibri" w:cs="Calibri" w:eastAsia="Calibri" w:hAnsi="Calibri"/>
-                <w:b w:val="false"/>
-                <w:bCs w:val="false"/>
-                <w:i w:val="false"/>
-                <w:iCs w:val="false"/>
-                <w:color w:val="262626"/>
-                <w:sz w:val="16"/>
-                <w:szCs w:val="16"/>
-              </w:rPr>
-              <w:t xml:space="preserve">0 — No heading block.</w:t>
+              <w:t>3 — Names, course and section, lab title and date, all present and correctly formatted.</w:t>
+            </w:r>
+          </w:p>
+        </w:tc>
+        <w:tc>
+          <w:tcPr>
+            <w:tcW w:type="dxa" w:w="0"/>
+            <w:tcMar>
+              <w:top w:type="dxa" w:w="60"/>
+              <w:left w:type="dxa" w:w="90"/>
+              <w:bottom w:type="dxa" w:w="60"/>
+              <w:right w:type="dxa" w:w="90"/>
+            </w:tcMar>
+          </w:tcPr>
+          <w:p>
+            <w:pPr>
+              <w:spacing w:after="0"/>
+            </w:pPr>
+            <w:r>
+              <w:rPr>
+                <w:rFonts w:ascii="Calibri" w:cs="Calibri" w:eastAsia="Calibri" w:hAnsi="Calibri"/>
+                <w:b w:val="false"/>
+                <w:bCs w:val="false"/>
+                <w:i w:val="false"/>
+                <w:iCs w:val="false"/>
+                <w:color w:val="262626"/>
+                <w:sz w:val="16"/>
+                <w:szCs w:val="16"/>
+              </w:rPr>
+              <w:t>2 — One item missing or misformatted.</w:t>
+            </w:r>
+          </w:p>
+        </w:tc>
+        <w:tc>
+          <w:tcPr>
+            <w:tcW w:type="dxa" w:w="0"/>
+            <w:tcMar>
+              <w:top w:type="dxa" w:w="60"/>
+              <w:left w:type="dxa" w:w="90"/>
+              <w:bottom w:type="dxa" w:w="60"/>
+              <w:right w:type="dxa" w:w="90"/>
+            </w:tcMar>
+          </w:tcPr>
+          <w:p>
+            <w:pPr>
+              <w:spacing w:after="0"/>
+            </w:pPr>
+            <w:r>
+              <w:rPr>
+                <w:rFonts w:ascii="Calibri" w:cs="Calibri" w:eastAsia="Calibri" w:hAnsi="Calibri"/>
+                <w:b w:val="false"/>
+                <w:bCs w:val="false"/>
+                <w:i w:val="false"/>
+                <w:iCs w:val="false"/>
+                <w:color w:val="262626"/>
+                <w:sz w:val="16"/>
+                <w:szCs w:val="16"/>
+              </w:rPr>
+              <w:t>2 — Template placeholders or brackets left in the heading, or the section number missing.</w:t>
+            </w:r>
+          </w:p>
+        </w:tc>
+        <w:tc>
+          <w:tcPr>
+            <w:tcW w:type="dxa" w:w="0"/>
+            <w:tcMar>
+              <w:top w:type="dxa" w:w="60"/>
+              <w:left w:type="dxa" w:w="90"/>
+              <w:bottom w:type="dxa" w:w="60"/>
+              <w:right w:type="dxa" w:w="90"/>
+            </w:tcMar>
+          </w:tcPr>
+          <w:p>
+            <w:pPr>
+              <w:spacing w:after="0"/>
+            </w:pPr>
+            <w:r>
+              <w:rPr>
+                <w:rFonts w:ascii="Calibri" w:cs="Calibri" w:eastAsia="Calibri" w:hAnsi="Calibri"/>
+                <w:b w:val="false"/>
+                <w:bCs w:val="false"/>
+                <w:i w:val="false"/>
+                <w:iCs w:val="false"/>
+                <w:color w:val="262626"/>
+                <w:sz w:val="16"/>
+                <w:szCs w:val="16"/>
+              </w:rPr>
+              <w:t>1 — Several items missing.</w:t>
+            </w:r>
+          </w:p>
+        </w:tc>
+        <w:tc>
+          <w:tcPr>
+            <w:tcW w:type="dxa" w:w="1512"/>
+          </w:tcPr>
+          <w:p>
+            <w:r>
+              <w:t>0 — No heading block.</w:t>
             </w:r>
           </w:p>
         </w:tc>
@@ -542,97 +563,107 @@
                 <w:sz w:val="16"/>
                 <w:szCs w:val="16"/>
               </w:rPr>
-              <w:t xml:space="preserve">7 — Four sentences or fewer. States what was measured, gives v₀ with its uncertainty and the percent differences, and says whether the prediction held. Nothing else.</w:t>
-            </w:r>
-          </w:p>
-        </w:tc>
-        <w:tc>
-          <w:tcPr>
-            <w:tcW w:type="dxa" w:w="0"/>
-            <w:shd w:fill="FFFDF8" w:color="auto" w:val="clear"/>
-            <w:tcMar>
-              <w:top w:type="dxa" w:w="60"/>
-              <w:left w:type="dxa" w:w="90"/>
-              <w:bottom w:type="dxa" w:w="60"/>
-              <w:right w:type="dxa" w:w="90"/>
-            </w:tcMar>
-          </w:tcPr>
-          <w:p>
-            <w:pPr>
-              <w:spacing w:after="0"/>
-            </w:pPr>
-            <w:r>
-              <w:rPr>
-                <w:rFonts w:ascii="Calibri" w:cs="Calibri" w:eastAsia="Calibri" w:hAnsi="Calibri"/>
-                <w:b w:val="false"/>
-                <w:bCs w:val="false"/>
-                <w:i w:val="false"/>
-                <w:iCs w:val="false"/>
-                <w:color w:val="262626"/>
-                <w:sz w:val="16"/>
-                <w:szCs w:val="16"/>
-              </w:rPr>
-              <w:t xml:space="preserve">5 — All content present but runs long or includes method detail.</w:t>
-            </w:r>
-          </w:p>
-        </w:tc>
-        <w:tc>
-          <w:tcPr>
-            <w:tcW w:type="dxa" w:w="0"/>
-            <w:shd w:fill="FFFDF8" w:color="auto" w:val="clear"/>
-            <w:tcMar>
-              <w:top w:type="dxa" w:w="60"/>
-              <w:left w:type="dxa" w:w="90"/>
-              <w:bottom w:type="dxa" w:w="60"/>
-              <w:right w:type="dxa" w:w="90"/>
-            </w:tcMar>
-          </w:tcPr>
-          <w:p>
-            <w:pPr>
-              <w:spacing w:after="0"/>
-            </w:pPr>
-            <w:r>
-              <w:rPr>
-                <w:rFonts w:ascii="Calibri" w:cs="Calibri" w:eastAsia="Calibri" w:hAnsi="Calibri"/>
-                <w:b w:val="false"/>
-                <w:bCs w:val="false"/>
-                <w:i w:val="false"/>
-                <w:iCs w:val="false"/>
-                <w:color w:val="262626"/>
-                <w:sz w:val="16"/>
-                <w:szCs w:val="16"/>
-              </w:rPr>
-              <w:t xml:space="preserve">3 — Describes the lab but reports no numbers.</w:t>
-            </w:r>
-          </w:p>
-        </w:tc>
-        <w:tc>
-          <w:tcPr>
-            <w:tcW w:type="dxa" w:w="0"/>
-            <w:shd w:fill="FFFDF8" w:color="auto" w:val="clear"/>
-            <w:tcMar>
-              <w:top w:type="dxa" w:w="60"/>
-              <w:left w:type="dxa" w:w="90"/>
-              <w:bottom w:type="dxa" w:w="60"/>
-              <w:right w:type="dxa" w:w="90"/>
-            </w:tcMar>
-          </w:tcPr>
-          <w:p>
-            <w:pPr>
-              <w:spacing w:after="0"/>
-            </w:pPr>
-            <w:r>
-              <w:rPr>
-                <w:rFonts w:ascii="Calibri" w:cs="Calibri" w:eastAsia="Calibri" w:hAnsi="Calibri"/>
-                <w:b w:val="false"/>
-                <w:bCs w:val="false"/>
-                <w:i w:val="false"/>
-                <w:iCs w:val="false"/>
-                <w:color w:val="262626"/>
-                <w:sz w:val="16"/>
-                <w:szCs w:val="16"/>
-              </w:rPr>
-              <w:t xml:space="preserve">0 — No abstract.</w:t>
+              <w:t>7 — Four sentences or fewer. States what was measured, gives v₀ with its uncertainty and the percent differences, and says whether the prediction held. Nothing else.</w:t>
+            </w:r>
+          </w:p>
+        </w:tc>
+        <w:tc>
+          <w:tcPr>
+            <w:tcW w:type="dxa" w:w="0"/>
+            <w:shd w:fill="FFFDF8" w:color="auto" w:val="clear"/>
+            <w:tcMar>
+              <w:top w:type="dxa" w:w="60"/>
+              <w:left w:type="dxa" w:w="90"/>
+              <w:bottom w:type="dxa" w:w="60"/>
+              <w:right w:type="dxa" w:w="90"/>
+            </w:tcMar>
+          </w:tcPr>
+          <w:p>
+            <w:pPr>
+              <w:spacing w:after="0"/>
+            </w:pPr>
+            <w:r>
+              <w:rPr>
+                <w:rFonts w:ascii="Calibri" w:cs="Calibri" w:eastAsia="Calibri" w:hAnsi="Calibri"/>
+                <w:b w:val="false"/>
+                <w:bCs w:val="false"/>
+                <w:i w:val="false"/>
+                <w:iCs w:val="false"/>
+                <w:color w:val="262626"/>
+                <w:sz w:val="16"/>
+                <w:szCs w:val="16"/>
+              </w:rPr>
+              <w:t>6 — All content present but runs long or includes method detail.</w:t>
+            </w:r>
+          </w:p>
+        </w:tc>
+        <w:tc>
+          <w:tcPr>
+            <w:tcW w:type="dxa" w:w="0"/>
+            <w:shd w:fill="FFFDF8" w:color="auto" w:val="clear"/>
+            <w:tcMar>
+              <w:top w:type="dxa" w:w="60"/>
+              <w:left w:type="dxa" w:w="90"/>
+              <w:bottom w:type="dxa" w:w="60"/>
+              <w:right w:type="dxa" w:w="90"/>
+            </w:tcMar>
+          </w:tcPr>
+          <w:p>
+            <w:pPr>
+              <w:spacing w:after="0"/>
+            </w:pPr>
+            <w:r>
+              <w:rPr>
+                <w:rFonts w:ascii="Calibri" w:cs="Calibri" w:eastAsia="Calibri" w:hAnsi="Calibri"/>
+                <w:b w:val="false"/>
+                <w:bCs w:val="false"/>
+                <w:i w:val="false"/>
+                <w:iCs w:val="false"/>
+                <w:color w:val="262626"/>
+                <w:sz w:val="16"/>
+                <w:szCs w:val="16"/>
+              </w:rPr>
+              <w:t>4 — Reports v₀ or the percent differences but not both, or gives v₀ with no uncertainty.</w:t>
+            </w:r>
+          </w:p>
+        </w:tc>
+        <w:tc>
+          <w:tcPr>
+            <w:tcW w:type="dxa" w:w="0"/>
+            <w:shd w:fill="FFFDF8" w:color="auto" w:val="clear"/>
+            <w:tcMar>
+              <w:top w:type="dxa" w:w="60"/>
+              <w:left w:type="dxa" w:w="90"/>
+              <w:bottom w:type="dxa" w:w="60"/>
+              <w:right w:type="dxa" w:w="90"/>
+            </w:tcMar>
+          </w:tcPr>
+          <w:p>
+            <w:pPr>
+              <w:spacing w:after="0"/>
+            </w:pPr>
+            <w:r>
+              <w:rPr>
+                <w:rFonts w:ascii="Calibri" w:cs="Calibri" w:eastAsia="Calibri" w:hAnsi="Calibri"/>
+                <w:b w:val="false"/>
+                <w:bCs w:val="false"/>
+                <w:i w:val="false"/>
+                <w:iCs w:val="false"/>
+                <w:color w:val="262626"/>
+                <w:sz w:val="16"/>
+                <w:szCs w:val="16"/>
+              </w:rPr>
+              <w:t>2 — Describes the lab but reports no numbers.</w:t>
+            </w:r>
+          </w:p>
+        </w:tc>
+        <w:tc>
+          <w:tcPr>
+            <w:tcW w:type="dxa" w:w="1512"/>
+          </w:tcPr>
+          <w:p>
+            <w:r>
+              <w:t>0 — No abstract.</w:t>
             </w:r>
           </w:p>
         </w:tc>
@@ -722,94 +753,104 @@
                 <w:sz w:val="16"/>
                 <w:szCs w:val="16"/>
               </w:rPr>
-              <w:t xml:space="preserve">10 — Derives d = v₀√(2h/g) line by line from the two axis equations, eliminating the shared time; every variable defined; states a hypothesis that can later be confirmed or rejected.</w:t>
-            </w:r>
-          </w:p>
-        </w:tc>
-        <w:tc>
-          <w:tcPr>
-            <w:tcW w:type="dxa" w:w="0"/>
-            <w:tcMar>
-              <w:top w:type="dxa" w:w="60"/>
-              <w:left w:type="dxa" w:w="90"/>
-              <w:bottom w:type="dxa" w:w="60"/>
-              <w:right w:type="dxa" w:w="90"/>
-            </w:tcMar>
-          </w:tcPr>
-          <w:p>
-            <w:pPr>
-              <w:spacing w:after="0"/>
-            </w:pPr>
-            <w:r>
-              <w:rPr>
-                <w:rFonts w:ascii="Calibri" w:cs="Calibri" w:eastAsia="Calibri" w:hAnsi="Calibri"/>
-                <w:b w:val="false"/>
-                <w:bCs w:val="false"/>
-                <w:i w:val="false"/>
-                <w:iCs w:val="false"/>
-                <w:color w:val="262626"/>
-                <w:sz w:val="16"/>
-                <w:szCs w:val="16"/>
-              </w:rPr>
-              <w:t xml:space="preserve">8 — Derivation present but a step or a variable definition is missing.</w:t>
-            </w:r>
-          </w:p>
-        </w:tc>
-        <w:tc>
-          <w:tcPr>
-            <w:tcW w:type="dxa" w:w="0"/>
-            <w:tcMar>
-              <w:top w:type="dxa" w:w="60"/>
-              <w:left w:type="dxa" w:w="90"/>
-              <w:bottom w:type="dxa" w:w="60"/>
-              <w:right w:type="dxa" w:w="90"/>
-            </w:tcMar>
-          </w:tcPr>
-          <w:p>
-            <w:pPr>
-              <w:spacing w:after="0"/>
-            </w:pPr>
-            <w:r>
-              <w:rPr>
-                <w:rFonts w:ascii="Calibri" w:cs="Calibri" w:eastAsia="Calibri" w:hAnsi="Calibri"/>
-                <w:b w:val="false"/>
-                <w:bCs w:val="false"/>
-                <w:i w:val="false"/>
-                <w:iCs w:val="false"/>
-                <w:color w:val="262626"/>
-                <w:sz w:val="16"/>
-                <w:szCs w:val="16"/>
-              </w:rPr>
-              <w:t xml:space="preserve">4 — The equation is quoted rather than derived, or there is no hypothesis.</w:t>
-            </w:r>
-          </w:p>
-        </w:tc>
-        <w:tc>
-          <w:tcPr>
-            <w:tcW w:type="dxa" w:w="0"/>
-            <w:tcMar>
-              <w:top w:type="dxa" w:w="60"/>
-              <w:left w:type="dxa" w:w="90"/>
-              <w:bottom w:type="dxa" w:w="60"/>
-              <w:right w:type="dxa" w:w="90"/>
-            </w:tcMar>
-          </w:tcPr>
-          <w:p>
-            <w:pPr>
-              <w:spacing w:after="0"/>
-            </w:pPr>
-            <w:r>
-              <w:rPr>
-                <w:rFonts w:ascii="Calibri" w:cs="Calibri" w:eastAsia="Calibri" w:hAnsi="Calibri"/>
-                <w:b w:val="false"/>
-                <w:bCs w:val="false"/>
-                <w:i w:val="false"/>
-                <w:iCs w:val="false"/>
-                <w:color w:val="262626"/>
-                <w:sz w:val="16"/>
-                <w:szCs w:val="16"/>
-              </w:rPr>
-              <w:t xml:space="preserve">0 — No introduction.</w:t>
+              <w:t>10 — Derives d = v₀√(2h/g) line by line from the two axis equations, eliminating the shared time; every variable defined; states a hypothesis that can later be confirmed or rejected.</w:t>
+            </w:r>
+          </w:p>
+        </w:tc>
+        <w:tc>
+          <w:tcPr>
+            <w:tcW w:type="dxa" w:w="0"/>
+            <w:tcMar>
+              <w:top w:type="dxa" w:w="60"/>
+              <w:left w:type="dxa" w:w="90"/>
+              <w:bottom w:type="dxa" w:w="60"/>
+              <w:right w:type="dxa" w:w="90"/>
+            </w:tcMar>
+          </w:tcPr>
+          <w:p>
+            <w:pPr>
+              <w:spacing w:after="0"/>
+            </w:pPr>
+            <w:r>
+              <w:rPr>
+                <w:rFonts w:ascii="Calibri" w:cs="Calibri" w:eastAsia="Calibri" w:hAnsi="Calibri"/>
+                <w:b w:val="false"/>
+                <w:bCs w:val="false"/>
+                <w:i w:val="false"/>
+                <w:iCs w:val="false"/>
+                <w:color w:val="262626"/>
+                <w:sz w:val="16"/>
+                <w:szCs w:val="16"/>
+              </w:rPr>
+              <w:t>8 — Derivation present but a step or a variable definition is missing.</w:t>
+            </w:r>
+          </w:p>
+        </w:tc>
+        <w:tc>
+          <w:tcPr>
+            <w:tcW w:type="dxa" w:w="0"/>
+            <w:tcMar>
+              <w:top w:type="dxa" w:w="60"/>
+              <w:left w:type="dxa" w:w="90"/>
+              <w:bottom w:type="dxa" w:w="60"/>
+              <w:right w:type="dxa" w:w="90"/>
+            </w:tcMar>
+          </w:tcPr>
+          <w:p>
+            <w:pPr>
+              <w:spacing w:after="0"/>
+            </w:pPr>
+            <w:r>
+              <w:rPr>
+                <w:rFonts w:ascii="Calibri" w:cs="Calibri" w:eastAsia="Calibri" w:hAnsi="Calibri"/>
+                <w:b w:val="false"/>
+                <w:bCs w:val="false"/>
+                <w:i w:val="false"/>
+                <w:iCs w:val="false"/>
+                <w:color w:val="262626"/>
+                <w:sz w:val="16"/>
+                <w:szCs w:val="16"/>
+              </w:rPr>
+              <w:t>6 — The derivation is sketched rather than worked line by line, or a variable is left undefined, though the hypothesis is present.</w:t>
+            </w:r>
+          </w:p>
+        </w:tc>
+        <w:tc>
+          <w:tcPr>
+            <w:tcW w:type="dxa" w:w="0"/>
+            <w:tcMar>
+              <w:top w:type="dxa" w:w="60"/>
+              <w:left w:type="dxa" w:w="90"/>
+              <w:bottom w:type="dxa" w:w="60"/>
+              <w:right w:type="dxa" w:w="90"/>
+            </w:tcMar>
+          </w:tcPr>
+          <w:p>
+            <w:pPr>
+              <w:spacing w:after="0"/>
+            </w:pPr>
+            <w:r>
+              <w:rPr>
+                <w:rFonts w:ascii="Calibri" w:cs="Calibri" w:eastAsia="Calibri" w:hAnsi="Calibri"/>
+                <w:b w:val="false"/>
+                <w:bCs w:val="false"/>
+                <w:i w:val="false"/>
+                <w:iCs w:val="false"/>
+                <w:color w:val="262626"/>
+                <w:sz w:val="16"/>
+                <w:szCs w:val="16"/>
+              </w:rPr>
+              <w:t>3 — The equation is quoted rather than derived, or there is no hypothesis.</w:t>
+            </w:r>
+          </w:p>
+        </w:tc>
+        <w:tc>
+          <w:tcPr>
+            <w:tcW w:type="dxa" w:w="1512"/>
+          </w:tcPr>
+          <w:p>
+            <w:r>
+              <w:t>0 — No introduction.</w:t>
             </w:r>
           </w:p>
         </w:tc>
@@ -902,97 +943,107 @@
                 <w:sz w:val="16"/>
                 <w:szCs w:val="16"/>
               </w:rPr>
-              <w:t xml:space="preserve">8 — Apparatus described in prose; a photo of the actual setup AND a labelled sketch, with both measurement reference points marked — where h is measured from and to, and where d is measured from and to.</w:t>
-            </w:r>
-          </w:p>
-        </w:tc>
-        <w:tc>
-          <w:tcPr>
-            <w:tcW w:type="dxa" w:w="0"/>
-            <w:shd w:fill="FFFDF8" w:color="auto" w:val="clear"/>
-            <w:tcMar>
-              <w:top w:type="dxa" w:w="60"/>
-              <w:left w:type="dxa" w:w="90"/>
-              <w:bottom w:type="dxa" w:w="60"/>
-              <w:right w:type="dxa" w:w="90"/>
-            </w:tcMar>
-          </w:tcPr>
-          <w:p>
-            <w:pPr>
-              <w:spacing w:after="0"/>
-            </w:pPr>
-            <w:r>
-              <w:rPr>
-                <w:rFonts w:ascii="Calibri" w:cs="Calibri" w:eastAsia="Calibri" w:hAnsi="Calibri"/>
-                <w:b w:val="false"/>
-                <w:bCs w:val="false"/>
-                <w:i w:val="false"/>
-                <w:iCs w:val="false"/>
-                <w:color w:val="262626"/>
-                <w:sz w:val="16"/>
-                <w:szCs w:val="16"/>
-              </w:rPr>
-              <w:t xml:space="preserve">6 — Photo and sketch present, but a reference point is unmarked or a component unlabelled.</w:t>
-            </w:r>
-          </w:p>
-        </w:tc>
-        <w:tc>
-          <w:tcPr>
-            <w:tcW w:type="dxa" w:w="0"/>
-            <w:shd w:fill="FFFDF8" w:color="auto" w:val="clear"/>
-            <w:tcMar>
-              <w:top w:type="dxa" w:w="60"/>
-              <w:left w:type="dxa" w:w="90"/>
-              <w:bottom w:type="dxa" w:w="60"/>
-              <w:right w:type="dxa" w:w="90"/>
-            </w:tcMar>
-          </w:tcPr>
-          <w:p>
-            <w:pPr>
-              <w:spacing w:after="0"/>
-            </w:pPr>
-            <w:r>
-              <w:rPr>
-                <w:rFonts w:ascii="Calibri" w:cs="Calibri" w:eastAsia="Calibri" w:hAnsi="Calibri"/>
-                <w:b w:val="false"/>
-                <w:bCs w:val="false"/>
-                <w:i w:val="false"/>
-                <w:iCs w:val="false"/>
-                <w:color w:val="262626"/>
-                <w:sz w:val="16"/>
-                <w:szCs w:val="16"/>
-              </w:rPr>
-              <w:t xml:space="preserve">3 — Bare equipment list, or only one of photo and sketch.</w:t>
-            </w:r>
-          </w:p>
-        </w:tc>
-        <w:tc>
-          <w:tcPr>
-            <w:tcW w:type="dxa" w:w="0"/>
-            <w:shd w:fill="FFFDF8" w:color="auto" w:val="clear"/>
-            <w:tcMar>
-              <w:top w:type="dxa" w:w="60"/>
-              <w:left w:type="dxa" w:w="90"/>
-              <w:bottom w:type="dxa" w:w="60"/>
-              <w:right w:type="dxa" w:w="90"/>
-            </w:tcMar>
-          </w:tcPr>
-          <w:p>
-            <w:pPr>
-              <w:spacing w:after="0"/>
-            </w:pPr>
-            <w:r>
-              <w:rPr>
-                <w:rFonts w:ascii="Calibri" w:cs="Calibri" w:eastAsia="Calibri" w:hAnsi="Calibri"/>
-                <w:b w:val="false"/>
-                <w:bCs w:val="false"/>
-                <w:i w:val="false"/>
-                <w:iCs w:val="false"/>
-                <w:color w:val="262626"/>
-                <w:sz w:val="16"/>
-                <w:szCs w:val="16"/>
-              </w:rPr>
-              <w:t xml:space="preserve">0 — No materials or setup description.</w:t>
+              <w:t>8 — Apparatus described in prose; a photo of the actual setup AND a labelled sketch, with both measurement reference points marked — where h is measured from and to, and where d is measured from and to.</w:t>
+            </w:r>
+          </w:p>
+        </w:tc>
+        <w:tc>
+          <w:tcPr>
+            <w:tcW w:type="dxa" w:w="0"/>
+            <w:shd w:fill="FFFDF8" w:color="auto" w:val="clear"/>
+            <w:tcMar>
+              <w:top w:type="dxa" w:w="60"/>
+              <w:left w:type="dxa" w:w="90"/>
+              <w:bottom w:type="dxa" w:w="60"/>
+              <w:right w:type="dxa" w:w="90"/>
+            </w:tcMar>
+          </w:tcPr>
+          <w:p>
+            <w:pPr>
+              <w:spacing w:after="0"/>
+            </w:pPr>
+            <w:r>
+              <w:rPr>
+                <w:rFonts w:ascii="Calibri" w:cs="Calibri" w:eastAsia="Calibri" w:hAnsi="Calibri"/>
+                <w:b w:val="false"/>
+                <w:bCs w:val="false"/>
+                <w:i w:val="false"/>
+                <w:iCs w:val="false"/>
+                <w:color w:val="262626"/>
+                <w:sz w:val="16"/>
+                <w:szCs w:val="16"/>
+              </w:rPr>
+              <w:t>7 — Photo and sketch present, but a reference point is unmarked or a component unlabelled.</w:t>
+            </w:r>
+          </w:p>
+        </w:tc>
+        <w:tc>
+          <w:tcPr>
+            <w:tcW w:type="dxa" w:w="0"/>
+            <w:shd w:fill="FFFDF8" w:color="auto" w:val="clear"/>
+            <w:tcMar>
+              <w:top w:type="dxa" w:w="60"/>
+              <w:left w:type="dxa" w:w="90"/>
+              <w:bottom w:type="dxa" w:w="60"/>
+              <w:right w:type="dxa" w:w="90"/>
+            </w:tcMar>
+          </w:tcPr>
+          <w:p>
+            <w:pPr>
+              <w:spacing w:after="0"/>
+            </w:pPr>
+            <w:r>
+              <w:rPr>
+                <w:rFonts w:ascii="Calibri" w:cs="Calibri" w:eastAsia="Calibri" w:hAnsi="Calibri"/>
+                <w:b w:val="false"/>
+                <w:bCs w:val="false"/>
+                <w:i w:val="false"/>
+                <w:iCs w:val="false"/>
+                <w:color w:val="262626"/>
+                <w:sz w:val="16"/>
+                <w:szCs w:val="16"/>
+              </w:rPr>
+              <w:t>5 — Apparatus described in prose with a photo or a sketch, but not both, or a measurement reference point is left unmarked.</w:t>
+            </w:r>
+          </w:p>
+        </w:tc>
+        <w:tc>
+          <w:tcPr>
+            <w:tcW w:type="dxa" w:w="0"/>
+            <w:shd w:fill="FFFDF8" w:color="auto" w:val="clear"/>
+            <w:tcMar>
+              <w:top w:type="dxa" w:w="60"/>
+              <w:left w:type="dxa" w:w="90"/>
+              <w:bottom w:type="dxa" w:w="60"/>
+              <w:right w:type="dxa" w:w="90"/>
+            </w:tcMar>
+          </w:tcPr>
+          <w:p>
+            <w:pPr>
+              <w:spacing w:after="0"/>
+            </w:pPr>
+            <w:r>
+              <w:rPr>
+                <w:rFonts w:ascii="Calibri" w:cs="Calibri" w:eastAsia="Calibri" w:hAnsi="Calibri"/>
+                <w:b w:val="false"/>
+                <w:bCs w:val="false"/>
+                <w:i w:val="false"/>
+                <w:iCs w:val="false"/>
+                <w:color w:val="262626"/>
+                <w:sz w:val="16"/>
+                <w:szCs w:val="16"/>
+              </w:rPr>
+              <w:t>3 — Bare equipment list, or only one of photo and sketch.</w:t>
+            </w:r>
+          </w:p>
+        </w:tc>
+        <w:tc>
+          <w:tcPr>
+            <w:tcW w:type="dxa" w:w="1512"/>
+          </w:tcPr>
+          <w:p>
+            <w:r>
+              <w:t>0 — No materials or setup description.</w:t>
             </w:r>
           </w:p>
         </w:tc>
@@ -1082,94 +1133,104 @@
                 <w:sz w:val="16"/>
                 <w:szCs w:val="16"/>
               </w:rPr>
-              <w:t xml:space="preserve">8 — Written in own words as prose, reproducible, and states how the launcher was levelled and how the plumb point was found.</w:t>
-            </w:r>
-          </w:p>
-        </w:tc>
-        <w:tc>
-          <w:tcPr>
-            <w:tcW w:type="dxa" w:w="0"/>
-            <w:tcMar>
-              <w:top w:type="dxa" w:w="60"/>
-              <w:left w:type="dxa" w:w="90"/>
-              <w:bottom w:type="dxa" w:w="60"/>
-              <w:right w:type="dxa" w:w="90"/>
-            </w:tcMar>
-          </w:tcPr>
-          <w:p>
-            <w:pPr>
-              <w:spacing w:after="0"/>
-            </w:pPr>
-            <w:r>
-              <w:rPr>
-                <w:rFonts w:ascii="Calibri" w:cs="Calibri" w:eastAsia="Calibri" w:hAnsi="Calibri"/>
-                <w:b w:val="false"/>
-                <w:bCs w:val="false"/>
-                <w:i w:val="false"/>
-                <w:iCs w:val="false"/>
-                <w:color w:val="262626"/>
-                <w:sz w:val="16"/>
-                <w:szCs w:val="16"/>
-              </w:rPr>
-              <w:t xml:space="preserve">6 — Reproducible but missing the levelling or the plumb-point detail.</w:t>
-            </w:r>
-          </w:p>
-        </w:tc>
-        <w:tc>
-          <w:tcPr>
-            <w:tcW w:type="dxa" w:w="0"/>
-            <w:tcMar>
-              <w:top w:type="dxa" w:w="60"/>
-              <w:left w:type="dxa" w:w="90"/>
-              <w:bottom w:type="dxa" w:w="60"/>
-              <w:right w:type="dxa" w:w="90"/>
-            </w:tcMar>
-          </w:tcPr>
-          <w:p>
-            <w:pPr>
-              <w:spacing w:after="0"/>
-            </w:pPr>
-            <w:r>
-              <w:rPr>
-                <w:rFonts w:ascii="Calibri" w:cs="Calibri" w:eastAsia="Calibri" w:hAnsi="Calibri"/>
-                <w:b w:val="false"/>
-                <w:bCs w:val="false"/>
-                <w:i w:val="false"/>
-                <w:iCs w:val="false"/>
-                <w:color w:val="262626"/>
-                <w:sz w:val="16"/>
-                <w:szCs w:val="16"/>
-              </w:rPr>
-              <w:t xml:space="preserve">3 — Copied or closely paraphrased from the handout.</w:t>
-            </w:r>
-          </w:p>
-        </w:tc>
-        <w:tc>
-          <w:tcPr>
-            <w:tcW w:type="dxa" w:w="0"/>
-            <w:tcMar>
-              <w:top w:type="dxa" w:w="60"/>
-              <w:left w:type="dxa" w:w="90"/>
-              <w:bottom w:type="dxa" w:w="60"/>
-              <w:right w:type="dxa" w:w="90"/>
-            </w:tcMar>
-          </w:tcPr>
-          <w:p>
-            <w:pPr>
-              <w:spacing w:after="0"/>
-            </w:pPr>
-            <w:r>
-              <w:rPr>
-                <w:rFonts w:ascii="Calibri" w:cs="Calibri" w:eastAsia="Calibri" w:hAnsi="Calibri"/>
-                <w:b w:val="false"/>
-                <w:bCs w:val="false"/>
-                <w:i w:val="false"/>
-                <w:iCs w:val="false"/>
-                <w:color w:val="262626"/>
-                <w:sz w:val="16"/>
-                <w:szCs w:val="16"/>
-              </w:rPr>
-              <w:t xml:space="preserve">0 — No procedure.</w:t>
+              <w:t>8 — Written in own words as prose, reproducible, and states how the launcher was levelled and how the plumb point was found.</w:t>
+            </w:r>
+          </w:p>
+        </w:tc>
+        <w:tc>
+          <w:tcPr>
+            <w:tcW w:type="dxa" w:w="0"/>
+            <w:tcMar>
+              <w:top w:type="dxa" w:w="60"/>
+              <w:left w:type="dxa" w:w="90"/>
+              <w:bottom w:type="dxa" w:w="60"/>
+              <w:right w:type="dxa" w:w="90"/>
+            </w:tcMar>
+          </w:tcPr>
+          <w:p>
+            <w:pPr>
+              <w:spacing w:after="0"/>
+            </w:pPr>
+            <w:r>
+              <w:rPr>
+                <w:rFonts w:ascii="Calibri" w:cs="Calibri" w:eastAsia="Calibri" w:hAnsi="Calibri"/>
+                <w:b w:val="false"/>
+                <w:bCs w:val="false"/>
+                <w:i w:val="false"/>
+                <w:iCs w:val="false"/>
+                <w:color w:val="262626"/>
+                <w:sz w:val="16"/>
+                <w:szCs w:val="16"/>
+              </w:rPr>
+              <w:t>7 — Reproducible and in the student's own words, but one detail is thin.</w:t>
+            </w:r>
+          </w:p>
+        </w:tc>
+        <w:tc>
+          <w:tcPr>
+            <w:tcW w:type="dxa" w:w="0"/>
+            <w:tcMar>
+              <w:top w:type="dxa" w:w="60"/>
+              <w:left w:type="dxa" w:w="90"/>
+              <w:bottom w:type="dxa" w:w="60"/>
+              <w:right w:type="dxa" w:w="90"/>
+            </w:tcMar>
+          </w:tcPr>
+          <w:p>
+            <w:pPr>
+              <w:spacing w:after="0"/>
+            </w:pPr>
+            <w:r>
+              <w:rPr>
+                <w:rFonts w:ascii="Calibri" w:cs="Calibri" w:eastAsia="Calibri" w:hAnsi="Calibri"/>
+                <w:b w:val="false"/>
+                <w:bCs w:val="false"/>
+                <w:i w:val="false"/>
+                <w:iCs w:val="false"/>
+                <w:color w:val="262626"/>
+                <w:sz w:val="16"/>
+                <w:szCs w:val="16"/>
+              </w:rPr>
+              <w:t>5 — Reproducible, but missing the levelling or the plumb-point detail.</w:t>
+            </w:r>
+          </w:p>
+        </w:tc>
+        <w:tc>
+          <w:tcPr>
+            <w:tcW w:type="dxa" w:w="0"/>
+            <w:tcMar>
+              <w:top w:type="dxa" w:w="60"/>
+              <w:left w:type="dxa" w:w="90"/>
+              <w:bottom w:type="dxa" w:w="60"/>
+              <w:right w:type="dxa" w:w="90"/>
+            </w:tcMar>
+          </w:tcPr>
+          <w:p>
+            <w:pPr>
+              <w:spacing w:after="0"/>
+            </w:pPr>
+            <w:r>
+              <w:rPr>
+                <w:rFonts w:ascii="Calibri" w:cs="Calibri" w:eastAsia="Calibri" w:hAnsi="Calibri"/>
+                <w:b w:val="false"/>
+                <w:bCs w:val="false"/>
+                <w:i w:val="false"/>
+                <w:iCs w:val="false"/>
+                <w:color w:val="262626"/>
+                <w:sz w:val="16"/>
+                <w:szCs w:val="16"/>
+              </w:rPr>
+              <w:t>3 — Copied or closely paraphrased from the handout.</w:t>
+            </w:r>
+          </w:p>
+        </w:tc>
+        <w:tc>
+          <w:tcPr>
+            <w:tcW w:type="dxa" w:w="1512"/>
+          </w:tcPr>
+          <w:p>
+            <w:r>
+              <w:t>0 — No procedure.</w:t>
             </w:r>
           </w:p>
         </w:tc>
@@ -1262,97 +1323,107 @@
                 <w:sz w:val="16"/>
                 <w:szCs w:val="16"/>
               </w:rPr>
-              <w:t xml:space="preserve">12 — Calibration table of five or more trials with mean and SEM; table of every launch height with predicted distance, mean measured distance, SEM and percent difference. All numbered, captioned, units and consistent significant digits, referenced in the text.</w:t>
-            </w:r>
-          </w:p>
-        </w:tc>
-        <w:tc>
-          <w:tcPr>
-            <w:tcW w:type="dxa" w:w="0"/>
-            <w:shd w:fill="FFFDF8" w:color="auto" w:val="clear"/>
-            <w:tcMar>
-              <w:top w:type="dxa" w:w="60"/>
-              <w:left w:type="dxa" w:w="90"/>
-              <w:bottom w:type="dxa" w:w="60"/>
-              <w:right w:type="dxa" w:w="90"/>
-            </w:tcMar>
-          </w:tcPr>
-          <w:p>
-            <w:pPr>
-              <w:spacing w:after="0"/>
-            </w:pPr>
-            <w:r>
-              <w:rPr>
-                <w:rFonts w:ascii="Calibri" w:cs="Calibri" w:eastAsia="Calibri" w:hAnsi="Calibri"/>
-                <w:b w:val="false"/>
-                <w:bCs w:val="false"/>
-                <w:i w:val="false"/>
-                <w:iCs w:val="false"/>
-                <w:color w:val="262626"/>
-                <w:sz w:val="16"/>
-                <w:szCs w:val="16"/>
-              </w:rPr>
-              <w:t xml:space="preserve">9 — Both tables present; minor issues with captions, units or significant digits.</w:t>
-            </w:r>
-          </w:p>
-        </w:tc>
-        <w:tc>
-          <w:tcPr>
-            <w:tcW w:type="dxa" w:w="0"/>
-            <w:shd w:fill="FFFDF8" w:color="auto" w:val="clear"/>
-            <w:tcMar>
-              <w:top w:type="dxa" w:w="60"/>
-              <w:left w:type="dxa" w:w="90"/>
-              <w:bottom w:type="dxa" w:w="60"/>
-              <w:right w:type="dxa" w:w="90"/>
-            </w:tcMar>
-          </w:tcPr>
-          <w:p>
-            <w:pPr>
-              <w:spacing w:after="0"/>
-            </w:pPr>
-            <w:r>
-              <w:rPr>
-                <w:rFonts w:ascii="Calibri" w:cs="Calibri" w:eastAsia="Calibri" w:hAnsi="Calibri"/>
-                <w:b w:val="false"/>
-                <w:bCs w:val="false"/>
-                <w:i w:val="false"/>
-                <w:iCs w:val="false"/>
-                <w:color w:val="262626"/>
-                <w:sz w:val="16"/>
-                <w:szCs w:val="16"/>
-              </w:rPr>
-              <w:t xml:space="preserve">5 — A table missing, or fewer than five trials at the calibration height.</w:t>
-            </w:r>
-          </w:p>
-        </w:tc>
-        <w:tc>
-          <w:tcPr>
-            <w:tcW w:type="dxa" w:w="0"/>
-            <w:shd w:fill="FFFDF8" w:color="auto" w:val="clear"/>
-            <w:tcMar>
-              <w:top w:type="dxa" w:w="60"/>
-              <w:left w:type="dxa" w:w="90"/>
-              <w:bottom w:type="dxa" w:w="60"/>
-              <w:right w:type="dxa" w:w="90"/>
-            </w:tcMar>
-          </w:tcPr>
-          <w:p>
-            <w:pPr>
-              <w:spacing w:after="0"/>
-            </w:pPr>
-            <w:r>
-              <w:rPr>
-                <w:rFonts w:ascii="Calibri" w:cs="Calibri" w:eastAsia="Calibri" w:hAnsi="Calibri"/>
-                <w:b w:val="false"/>
-                <w:bCs w:val="false"/>
-                <w:i w:val="false"/>
-                <w:iCs w:val="false"/>
-                <w:color w:val="262626"/>
-                <w:sz w:val="16"/>
-                <w:szCs w:val="16"/>
-              </w:rPr>
-              <w:t xml:space="preserve">0 — No data tables.</w:t>
+              <w:t>12 — Calibration table of five or more trials with mean and SEM; table of every launch height with predicted distance, mean measured distance, SEM and percent difference. All numbered, captioned, units and consistent significant digits, referenced in the text.</w:t>
+            </w:r>
+          </w:p>
+        </w:tc>
+        <w:tc>
+          <w:tcPr>
+            <w:tcW w:type="dxa" w:w="0"/>
+            <w:shd w:fill="FFFDF8" w:color="auto" w:val="clear"/>
+            <w:tcMar>
+              <w:top w:type="dxa" w:w="60"/>
+              <w:left w:type="dxa" w:w="90"/>
+              <w:bottom w:type="dxa" w:w="60"/>
+              <w:right w:type="dxa" w:w="90"/>
+            </w:tcMar>
+          </w:tcPr>
+          <w:p>
+            <w:pPr>
+              <w:spacing w:after="0"/>
+            </w:pPr>
+            <w:r>
+              <w:rPr>
+                <w:rFonts w:ascii="Calibri" w:cs="Calibri" w:eastAsia="Calibri" w:hAnsi="Calibri"/>
+                <w:b w:val="false"/>
+                <w:bCs w:val="false"/>
+                <w:i w:val="false"/>
+                <w:iCs w:val="false"/>
+                <w:color w:val="262626"/>
+                <w:sz w:val="16"/>
+                <w:szCs w:val="16"/>
+              </w:rPr>
+              <w:t>10 — Both tables present; minor issues with captions, units or significant digits.</w:t>
+            </w:r>
+          </w:p>
+        </w:tc>
+        <w:tc>
+          <w:tcPr>
+            <w:tcW w:type="dxa" w:w="0"/>
+            <w:shd w:fill="FFFDF8" w:color="auto" w:val="clear"/>
+            <w:tcMar>
+              <w:top w:type="dxa" w:w="60"/>
+              <w:left w:type="dxa" w:w="90"/>
+              <w:bottom w:type="dxa" w:w="60"/>
+              <w:right w:type="dxa" w:w="90"/>
+            </w:tcMar>
+          </w:tcPr>
+          <w:p>
+            <w:pPr>
+              <w:spacing w:after="0"/>
+            </w:pPr>
+            <w:r>
+              <w:rPr>
+                <w:rFonts w:ascii="Calibri" w:cs="Calibri" w:eastAsia="Calibri" w:hAnsi="Calibri"/>
+                <w:b w:val="false"/>
+                <w:bCs w:val="false"/>
+                <w:i w:val="false"/>
+                <w:iCs w:val="false"/>
+                <w:color w:val="262626"/>
+                <w:sz w:val="16"/>
+                <w:szCs w:val="16"/>
+              </w:rPr>
+              <w:t>7 — One of the two tables is complete but the other is missing or thin, or the calibration run has fewer than five trials.</w:t>
+            </w:r>
+          </w:p>
+        </w:tc>
+        <w:tc>
+          <w:tcPr>
+            <w:tcW w:type="dxa" w:w="0"/>
+            <w:shd w:fill="FFFDF8" w:color="auto" w:val="clear"/>
+            <w:tcMar>
+              <w:top w:type="dxa" w:w="60"/>
+              <w:left w:type="dxa" w:w="90"/>
+              <w:bottom w:type="dxa" w:w="60"/>
+              <w:right w:type="dxa" w:w="90"/>
+            </w:tcMar>
+          </w:tcPr>
+          <w:p>
+            <w:pPr>
+              <w:spacing w:after="0"/>
+            </w:pPr>
+            <w:r>
+              <w:rPr>
+                <w:rFonts w:ascii="Calibri" w:cs="Calibri" w:eastAsia="Calibri" w:hAnsi="Calibri"/>
+                <w:b w:val="false"/>
+                <w:bCs w:val="false"/>
+                <w:i w:val="false"/>
+                <w:iCs w:val="false"/>
+                <w:color w:val="262626"/>
+                <w:sz w:val="16"/>
+                <w:szCs w:val="16"/>
+              </w:rPr>
+              <w:t>4 — A table missing, or fewer than five trials at the calibration height.</w:t>
+            </w:r>
+          </w:p>
+        </w:tc>
+        <w:tc>
+          <w:tcPr>
+            <w:tcW w:type="dxa" w:w="1512"/>
+          </w:tcPr>
+          <w:p>
+            <w:r>
+              <w:t>0 — No data tables.</w:t>
             </w:r>
           </w:p>
         </w:tc>
@@ -1442,94 +1513,104 @@
                 <w:sz w:val="16"/>
                 <w:szCs w:val="16"/>
               </w:rPr>
-              <w:t xml:space="preserve">9 — One graph carrying both: the theory as a smooth dashed curve CALCULATED from v₀, and the measured means as discrete markers with vertical error bars. Numbered as a Figure, captioned below, described in the text.</w:t>
-            </w:r>
-          </w:p>
-        </w:tc>
-        <w:tc>
-          <w:tcPr>
-            <w:tcW w:type="dxa" w:w="0"/>
-            <w:tcMar>
-              <w:top w:type="dxa" w:w="60"/>
-              <w:left w:type="dxa" w:w="90"/>
-              <w:bottom w:type="dxa" w:w="60"/>
-              <w:right w:type="dxa" w:w="90"/>
-            </w:tcMar>
-          </w:tcPr>
-          <w:p>
-            <w:pPr>
-              <w:spacing w:after="0"/>
-            </w:pPr>
-            <w:r>
-              <w:rPr>
-                <w:rFonts w:ascii="Calibri" w:cs="Calibri" w:eastAsia="Calibri" w:hAnsi="Calibri"/>
-                <w:b w:val="false"/>
-                <w:bCs w:val="false"/>
-                <w:i w:val="false"/>
-                <w:iCs w:val="false"/>
-                <w:color w:val="262626"/>
-                <w:sz w:val="16"/>
-                <w:szCs w:val="16"/>
-              </w:rPr>
-              <w:t xml:space="preserve">7 — Both series present; the curve is fitted to the data rather than calculated, or error bars are missing.</w:t>
-            </w:r>
-          </w:p>
-        </w:tc>
-        <w:tc>
-          <w:tcPr>
-            <w:tcW w:type="dxa" w:w="0"/>
-            <w:tcMar>
-              <w:top w:type="dxa" w:w="60"/>
-              <w:left w:type="dxa" w:w="90"/>
-              <w:bottom w:type="dxa" w:w="60"/>
-              <w:right w:type="dxa" w:w="90"/>
-            </w:tcMar>
-          </w:tcPr>
-          <w:p>
-            <w:pPr>
-              <w:spacing w:after="0"/>
-            </w:pPr>
-            <w:r>
-              <w:rPr>
-                <w:rFonts w:ascii="Calibri" w:cs="Calibri" w:eastAsia="Calibri" w:hAnsi="Calibri"/>
-                <w:b w:val="false"/>
-                <w:bCs w:val="false"/>
-                <w:i w:val="false"/>
-                <w:iCs w:val="false"/>
-                <w:color w:val="262626"/>
-                <w:sz w:val="16"/>
-                <w:szCs w:val="16"/>
-              </w:rPr>
-              <w:t xml:space="preserve">4 — Only one series plotted, or the data joined dot-to-dot.</w:t>
-            </w:r>
-          </w:p>
-        </w:tc>
-        <w:tc>
-          <w:tcPr>
-            <w:tcW w:type="dxa" w:w="0"/>
-            <w:tcMar>
-              <w:top w:type="dxa" w:w="60"/>
-              <w:left w:type="dxa" w:w="90"/>
-              <w:bottom w:type="dxa" w:w="60"/>
-              <w:right w:type="dxa" w:w="90"/>
-            </w:tcMar>
-          </w:tcPr>
-          <w:p>
-            <w:pPr>
-              <w:spacing w:after="0"/>
-            </w:pPr>
-            <w:r>
-              <w:rPr>
-                <w:rFonts w:ascii="Calibri" w:cs="Calibri" w:eastAsia="Calibri" w:hAnsi="Calibri"/>
-                <w:b w:val="false"/>
-                <w:bCs w:val="false"/>
-                <w:i w:val="false"/>
-                <w:iCs w:val="false"/>
-                <w:color w:val="262626"/>
-                <w:sz w:val="16"/>
-                <w:szCs w:val="16"/>
-              </w:rPr>
-              <w:t xml:space="preserve">0 — No graph.</w:t>
+              <w:t>9 — One graph carrying both: the theory as a smooth dashed curve CALCULATED from v₀, and the measured means as discrete markers with vertical error bars. Numbered as a Figure, captioned below, described in the text.</w:t>
+            </w:r>
+          </w:p>
+        </w:tc>
+        <w:tc>
+          <w:tcPr>
+            <w:tcW w:type="dxa" w:w="0"/>
+            <w:tcMar>
+              <w:top w:type="dxa" w:w="60"/>
+              <w:left w:type="dxa" w:w="90"/>
+              <w:bottom w:type="dxa" w:w="60"/>
+              <w:right w:type="dxa" w:w="90"/>
+            </w:tcMar>
+          </w:tcPr>
+          <w:p>
+            <w:pPr>
+              <w:spacing w:after="0"/>
+            </w:pPr>
+            <w:r>
+              <w:rPr>
+                <w:rFonts w:ascii="Calibri" w:cs="Calibri" w:eastAsia="Calibri" w:hAnsi="Calibri"/>
+                <w:b w:val="false"/>
+                <w:bCs w:val="false"/>
+                <w:i w:val="false"/>
+                <w:iCs w:val="false"/>
+                <w:color w:val="262626"/>
+                <w:sz w:val="16"/>
+                <w:szCs w:val="16"/>
+              </w:rPr>
+              <w:t>7 — Both series present and correctly calculated; a caption or the in-text description is incomplete.</w:t>
+            </w:r>
+          </w:p>
+        </w:tc>
+        <w:tc>
+          <w:tcPr>
+            <w:tcW w:type="dxa" w:w="0"/>
+            <w:tcMar>
+              <w:top w:type="dxa" w:w="60"/>
+              <w:left w:type="dxa" w:w="90"/>
+              <w:bottom w:type="dxa" w:w="60"/>
+              <w:right w:type="dxa" w:w="90"/>
+            </w:tcMar>
+          </w:tcPr>
+          <w:p>
+            <w:pPr>
+              <w:spacing w:after="0"/>
+            </w:pPr>
+            <w:r>
+              <w:rPr>
+                <w:rFonts w:ascii="Calibri" w:cs="Calibri" w:eastAsia="Calibri" w:hAnsi="Calibri"/>
+                <w:b w:val="false"/>
+                <w:bCs w:val="false"/>
+                <w:i w:val="false"/>
+                <w:iCs w:val="false"/>
+                <w:color w:val="262626"/>
+                <w:sz w:val="16"/>
+                <w:szCs w:val="16"/>
+              </w:rPr>
+              <w:t>5 — Both series present, but the theory curve is fitted to the data rather than calculated from v₀, or the error bars are missing.</w:t>
+            </w:r>
+          </w:p>
+        </w:tc>
+        <w:tc>
+          <w:tcPr>
+            <w:tcW w:type="dxa" w:w="0"/>
+            <w:tcMar>
+              <w:top w:type="dxa" w:w="60"/>
+              <w:left w:type="dxa" w:w="90"/>
+              <w:bottom w:type="dxa" w:w="60"/>
+              <w:right w:type="dxa" w:w="90"/>
+            </w:tcMar>
+          </w:tcPr>
+          <w:p>
+            <w:pPr>
+              <w:spacing w:after="0"/>
+            </w:pPr>
+            <w:r>
+              <w:rPr>
+                <w:rFonts w:ascii="Calibri" w:cs="Calibri" w:eastAsia="Calibri" w:hAnsi="Calibri"/>
+                <w:b w:val="false"/>
+                <w:bCs w:val="false"/>
+                <w:i w:val="false"/>
+                <w:iCs w:val="false"/>
+                <w:color w:val="262626"/>
+                <w:sz w:val="16"/>
+                <w:szCs w:val="16"/>
+              </w:rPr>
+              <w:t>3 — Only one series plotted, or the data joined dot-to-dot.</w:t>
+            </w:r>
+          </w:p>
+        </w:tc>
+        <w:tc>
+          <w:tcPr>
+            <w:tcW w:type="dxa" w:w="1512"/>
+          </w:tcPr>
+          <w:p>
+            <w:r>
+              <w:t>0 — No graph.</w:t>
             </w:r>
           </w:p>
         </w:tc>
@@ -1622,97 +1703,107 @@
                 <w:sz w:val="16"/>
                 <w:szCs w:val="16"/>
               </w:rPr>
-              <w:t xml:space="preserve">13 — One worked sample of each type, with units at every step: fall time, v₀ from h and d̄, uncertainty propagation in v₀, predicted d at a new height, mean and SEM, percent difference.</w:t>
-            </w:r>
-          </w:p>
-        </w:tc>
-        <w:tc>
-          <w:tcPr>
-            <w:tcW w:type="dxa" w:w="0"/>
-            <w:shd w:fill="FFFDF8" w:color="auto" w:val="clear"/>
-            <w:tcMar>
-              <w:top w:type="dxa" w:w="60"/>
-              <w:left w:type="dxa" w:w="90"/>
-              <w:bottom w:type="dxa" w:w="60"/>
-              <w:right w:type="dxa" w:w="90"/>
-            </w:tcMar>
-          </w:tcPr>
-          <w:p>
-            <w:pPr>
-              <w:spacing w:after="0"/>
-            </w:pPr>
-            <w:r>
-              <w:rPr>
-                <w:rFonts w:ascii="Calibri" w:cs="Calibri" w:eastAsia="Calibri" w:hAnsi="Calibri"/>
-                <w:b w:val="false"/>
-                <w:bCs w:val="false"/>
-                <w:i w:val="false"/>
-                <w:iCs w:val="false"/>
-                <w:color w:val="262626"/>
-                <w:sz w:val="16"/>
-                <w:szCs w:val="16"/>
-              </w:rPr>
-              <w:t xml:space="preserve">10 — All types present with minor unit or rounding slips.</w:t>
-            </w:r>
-          </w:p>
-        </w:tc>
-        <w:tc>
-          <w:tcPr>
-            <w:tcW w:type="dxa" w:w="0"/>
-            <w:shd w:fill="FFFDF8" w:color="auto" w:val="clear"/>
-            <w:tcMar>
-              <w:top w:type="dxa" w:w="60"/>
-              <w:left w:type="dxa" w:w="90"/>
-              <w:bottom w:type="dxa" w:w="60"/>
-              <w:right w:type="dxa" w:w="90"/>
-            </w:tcMar>
-          </w:tcPr>
-          <w:p>
-            <w:pPr>
-              <w:spacing w:after="0"/>
-            </w:pPr>
-            <w:r>
-              <w:rPr>
-                <w:rFonts w:ascii="Calibri" w:cs="Calibri" w:eastAsia="Calibri" w:hAnsi="Calibri"/>
-                <w:b w:val="false"/>
-                <w:bCs w:val="false"/>
-                <w:i w:val="false"/>
-                <w:iCs w:val="false"/>
-                <w:color w:val="262626"/>
-                <w:sz w:val="16"/>
-                <w:szCs w:val="16"/>
-              </w:rPr>
-              <w:t xml:space="preserve">5 — Some types missing, or units given only in the final answer.</w:t>
-            </w:r>
-          </w:p>
-        </w:tc>
-        <w:tc>
-          <w:tcPr>
-            <w:tcW w:type="dxa" w:w="0"/>
-            <w:shd w:fill="FFFDF8" w:color="auto" w:val="clear"/>
-            <w:tcMar>
-              <w:top w:type="dxa" w:w="60"/>
-              <w:left w:type="dxa" w:w="90"/>
-              <w:bottom w:type="dxa" w:w="60"/>
-              <w:right w:type="dxa" w:w="90"/>
-            </w:tcMar>
-          </w:tcPr>
-          <w:p>
-            <w:pPr>
-              <w:spacing w:after="0"/>
-            </w:pPr>
-            <w:r>
-              <w:rPr>
-                <w:rFonts w:ascii="Calibri" w:cs="Calibri" w:eastAsia="Calibri" w:hAnsi="Calibri"/>
-                <w:b w:val="false"/>
-                <w:bCs w:val="false"/>
-                <w:i w:val="false"/>
-                <w:iCs w:val="false"/>
-                <w:color w:val="262626"/>
-                <w:sz w:val="16"/>
-                <w:szCs w:val="16"/>
-              </w:rPr>
-              <w:t xml:space="preserve">0 — No sample calculations.</w:t>
+              <w:t>13 — One worked sample of each type, with units at every step: fall time, v₀ from h and d̄, uncertainty propagation in v₀, predicted d at a new height, mean and SEM, percent difference.</w:t>
+            </w:r>
+          </w:p>
+        </w:tc>
+        <w:tc>
+          <w:tcPr>
+            <w:tcW w:type="dxa" w:w="0"/>
+            <w:shd w:fill="FFFDF8" w:color="auto" w:val="clear"/>
+            <w:tcMar>
+              <w:top w:type="dxa" w:w="60"/>
+              <w:left w:type="dxa" w:w="90"/>
+              <w:bottom w:type="dxa" w:w="60"/>
+              <w:right w:type="dxa" w:w="90"/>
+            </w:tcMar>
+          </w:tcPr>
+          <w:p>
+            <w:pPr>
+              <w:spacing w:after="0"/>
+            </w:pPr>
+            <w:r>
+              <w:rPr>
+                <w:rFonts w:ascii="Calibri" w:cs="Calibri" w:eastAsia="Calibri" w:hAnsi="Calibri"/>
+                <w:b w:val="false"/>
+                <w:bCs w:val="false"/>
+                <w:i w:val="false"/>
+                <w:iCs w:val="false"/>
+                <w:color w:val="262626"/>
+                <w:sz w:val="16"/>
+                <w:szCs w:val="16"/>
+              </w:rPr>
+              <w:t>11 — All types present with minor unit or rounding slips.</w:t>
+            </w:r>
+          </w:p>
+        </w:tc>
+        <w:tc>
+          <w:tcPr>
+            <w:tcW w:type="dxa" w:w="0"/>
+            <w:shd w:fill="FFFDF8" w:color="auto" w:val="clear"/>
+            <w:tcMar>
+              <w:top w:type="dxa" w:w="60"/>
+              <w:left w:type="dxa" w:w="90"/>
+              <w:bottom w:type="dxa" w:w="60"/>
+              <w:right w:type="dxa" w:w="90"/>
+            </w:tcMar>
+          </w:tcPr>
+          <w:p>
+            <w:pPr>
+              <w:spacing w:after="0"/>
+            </w:pPr>
+            <w:r>
+              <w:rPr>
+                <w:rFonts w:ascii="Calibri" w:cs="Calibri" w:eastAsia="Calibri" w:hAnsi="Calibri"/>
+                <w:b w:val="false"/>
+                <w:bCs w:val="false"/>
+                <w:i w:val="false"/>
+                <w:iCs w:val="false"/>
+                <w:color w:val="262626"/>
+                <w:sz w:val="16"/>
+                <w:szCs w:val="16"/>
+              </w:rPr>
+              <w:t>8 — Four or five of the six types worked; one or two missing.</w:t>
+            </w:r>
+          </w:p>
+        </w:tc>
+        <w:tc>
+          <w:tcPr>
+            <w:tcW w:type="dxa" w:w="0"/>
+            <w:shd w:fill="FFFDF8" w:color="auto" w:val="clear"/>
+            <w:tcMar>
+              <w:top w:type="dxa" w:w="60"/>
+              <w:left w:type="dxa" w:w="90"/>
+              <w:bottom w:type="dxa" w:w="60"/>
+              <w:right w:type="dxa" w:w="90"/>
+            </w:tcMar>
+          </w:tcPr>
+          <w:p>
+            <w:pPr>
+              <w:spacing w:after="0"/>
+            </w:pPr>
+            <w:r>
+              <w:rPr>
+                <w:rFonts w:ascii="Calibri" w:cs="Calibri" w:eastAsia="Calibri" w:hAnsi="Calibri"/>
+                <w:b w:val="false"/>
+                <w:bCs w:val="false"/>
+                <w:i w:val="false"/>
+                <w:iCs w:val="false"/>
+                <w:color w:val="262626"/>
+                <w:sz w:val="16"/>
+                <w:szCs w:val="16"/>
+              </w:rPr>
+              <w:t>4 — Some types missing, or units given only in the final answer.</w:t>
+            </w:r>
+          </w:p>
+        </w:tc>
+        <w:tc>
+          <w:tcPr>
+            <w:tcW w:type="dxa" w:w="1512"/>
+          </w:tcPr>
+          <w:p>
+            <w:r>
+              <w:t>0 — No sample calculations.</w:t>
             </w:r>
           </w:p>
         </w:tc>
@@ -1802,94 +1893,104 @@
                 <w:sz w:val="16"/>
                 <w:szCs w:val="16"/>
               </w:rPr>
-              <w:t xml:space="preserve">15 — Opens with the measured v₀ ± uncertainty; states whether the hypothesis is confirmed and argues it with the 10% rule; addresses the PATTERN in the percent differences across heights, not only their average; states plainly for each height whether the ball landed in the cup, including the misses.</w:t>
-            </w:r>
-          </w:p>
-        </w:tc>
-        <w:tc>
-          <w:tcPr>
-            <w:tcW w:type="dxa" w:w="0"/>
-            <w:tcMar>
-              <w:top w:type="dxa" w:w="60"/>
-              <w:left w:type="dxa" w:w="90"/>
-              <w:bottom w:type="dxa" w:w="60"/>
-              <w:right w:type="dxa" w:w="90"/>
-            </w:tcMar>
-          </w:tcPr>
-          <w:p>
-            <w:pPr>
-              <w:spacing w:after="0"/>
-            </w:pPr>
-            <w:r>
-              <w:rPr>
-                <w:rFonts w:ascii="Calibri" w:cs="Calibri" w:eastAsia="Calibri" w:hAnsi="Calibri"/>
-                <w:b w:val="false"/>
-                <w:bCs w:val="false"/>
-                <w:i w:val="false"/>
-                <w:iCs w:val="false"/>
-                <w:color w:val="262626"/>
-                <w:sz w:val="16"/>
-                <w:szCs w:val="16"/>
-              </w:rPr>
-              <w:t xml:space="preserve">12 — Most of the above; one element thin or missing.</w:t>
-            </w:r>
-          </w:p>
-        </w:tc>
-        <w:tc>
-          <w:tcPr>
-            <w:tcW w:type="dxa" w:w="0"/>
-            <w:tcMar>
-              <w:top w:type="dxa" w:w="60"/>
-              <w:left w:type="dxa" w:w="90"/>
-              <w:bottom w:type="dxa" w:w="60"/>
-              <w:right w:type="dxa" w:w="90"/>
-            </w:tcMar>
-          </w:tcPr>
-          <w:p>
-            <w:pPr>
-              <w:spacing w:after="0"/>
-            </w:pPr>
-            <w:r>
-              <w:rPr>
-                <w:rFonts w:ascii="Calibri" w:cs="Calibri" w:eastAsia="Calibri" w:hAnsi="Calibri"/>
-                <w:b w:val="false"/>
-                <w:bCs w:val="false"/>
-                <w:i w:val="false"/>
-                <w:iCs w:val="false"/>
-                <w:color w:val="262626"/>
-                <w:sz w:val="16"/>
-                <w:szCs w:val="16"/>
-              </w:rPr>
-              <w:t xml:space="preserve">6 — Restates the results without interpreting them, or reports only an average percent difference.</w:t>
-            </w:r>
-          </w:p>
-        </w:tc>
-        <w:tc>
-          <w:tcPr>
-            <w:tcW w:type="dxa" w:w="0"/>
-            <w:tcMar>
-              <w:top w:type="dxa" w:w="60"/>
-              <w:left w:type="dxa" w:w="90"/>
-              <w:bottom w:type="dxa" w:w="60"/>
-              <w:right w:type="dxa" w:w="90"/>
-            </w:tcMar>
-          </w:tcPr>
-          <w:p>
-            <w:pPr>
-              <w:spacing w:after="0"/>
-            </w:pPr>
-            <w:r>
-              <w:rPr>
-                <w:rFonts w:ascii="Calibri" w:cs="Calibri" w:eastAsia="Calibri" w:hAnsi="Calibri"/>
-                <w:b w:val="false"/>
-                <w:bCs w:val="false"/>
-                <w:i w:val="false"/>
-                <w:iCs w:val="false"/>
-                <w:color w:val="262626"/>
-                <w:sz w:val="16"/>
-                <w:szCs w:val="16"/>
-              </w:rPr>
-              <w:t xml:space="preserve">0 — No discussion.</w:t>
+              <w:t>15 — Opens with the measured v₀ ± uncertainty; states whether the hypothesis is confirmed and argues it with the 10% rule; addresses the PATTERN in the percent differences across heights, not only their average; states plainly for each height whether the ball landed in the cup, including the misses.</w:t>
+            </w:r>
+          </w:p>
+        </w:tc>
+        <w:tc>
+          <w:tcPr>
+            <w:tcW w:type="dxa" w:w="0"/>
+            <w:tcMar>
+              <w:top w:type="dxa" w:w="60"/>
+              <w:left w:type="dxa" w:w="90"/>
+              <w:bottom w:type="dxa" w:w="60"/>
+              <w:right w:type="dxa" w:w="90"/>
+            </w:tcMar>
+          </w:tcPr>
+          <w:p>
+            <w:pPr>
+              <w:spacing w:after="0"/>
+            </w:pPr>
+            <w:r>
+              <w:rPr>
+                <w:rFonts w:ascii="Calibri" w:cs="Calibri" w:eastAsia="Calibri" w:hAnsi="Calibri"/>
+                <w:b w:val="false"/>
+                <w:bCs w:val="false"/>
+                <w:i w:val="false"/>
+                <w:iCs w:val="false"/>
+                <w:color w:val="262626"/>
+                <w:sz w:val="16"/>
+                <w:szCs w:val="16"/>
+              </w:rPr>
+              <w:t>12 — Most of the above; one element thin or missing.</w:t>
+            </w:r>
+          </w:p>
+        </w:tc>
+        <w:tc>
+          <w:tcPr>
+            <w:tcW w:type="dxa" w:w="0"/>
+            <w:tcMar>
+              <w:top w:type="dxa" w:w="60"/>
+              <w:left w:type="dxa" w:w="90"/>
+              <w:bottom w:type="dxa" w:w="60"/>
+              <w:right w:type="dxa" w:w="90"/>
+            </w:tcMar>
+          </w:tcPr>
+          <w:p>
+            <w:pPr>
+              <w:spacing w:after="0"/>
+            </w:pPr>
+            <w:r>
+              <w:rPr>
+                <w:rFonts w:ascii="Calibri" w:cs="Calibri" w:eastAsia="Calibri" w:hAnsi="Calibri"/>
+                <w:b w:val="false"/>
+                <w:bCs w:val="false"/>
+                <w:i w:val="false"/>
+                <w:iCs w:val="false"/>
+                <w:color w:val="262626"/>
+                <w:sz w:val="16"/>
+                <w:szCs w:val="16"/>
+              </w:rPr>
+              <w:t>9 — Opens with a result and interprets it, but two or three of the required moves are absent — the 10% argument, the pattern in the percent differences across heights, or the per-height record of whether the ball landed in the cup.</w:t>
+            </w:r>
+          </w:p>
+        </w:tc>
+        <w:tc>
+          <w:tcPr>
+            <w:tcW w:type="dxa" w:w="0"/>
+            <w:tcMar>
+              <w:top w:type="dxa" w:w="60"/>
+              <w:left w:type="dxa" w:w="90"/>
+              <w:bottom w:type="dxa" w:w="60"/>
+              <w:right w:type="dxa" w:w="90"/>
+            </w:tcMar>
+          </w:tcPr>
+          <w:p>
+            <w:pPr>
+              <w:spacing w:after="0"/>
+            </w:pPr>
+            <w:r>
+              <w:rPr>
+                <w:rFonts w:ascii="Calibri" w:cs="Calibri" w:eastAsia="Calibri" w:hAnsi="Calibri"/>
+                <w:b w:val="false"/>
+                <w:bCs w:val="false"/>
+                <w:i w:val="false"/>
+                <w:iCs w:val="false"/>
+                <w:color w:val="262626"/>
+                <w:sz w:val="16"/>
+                <w:szCs w:val="16"/>
+              </w:rPr>
+              <w:t>5 — Restates the results without interpreting them, or reports only an average percent difference.</w:t>
+            </w:r>
+          </w:p>
+        </w:tc>
+        <w:tc>
+          <w:tcPr>
+            <w:tcW w:type="dxa" w:w="1512"/>
+          </w:tcPr>
+          <w:p>
+            <w:r>
+              <w:t>0 — No discussion.</w:t>
             </w:r>
           </w:p>
         </w:tc>
@@ -1982,97 +2083,107 @@
                 <w:sz w:val="16"/>
                 <w:szCs w:val="16"/>
               </w:rPr>
-              <w:t xml:space="preserve">5 — All three Additional Questions (AQ1–AQ3) answered in paragraphs, in a dedicated section.</w:t>
-            </w:r>
-          </w:p>
-        </w:tc>
-        <w:tc>
-          <w:tcPr>
-            <w:tcW w:type="dxa" w:w="0"/>
-            <w:shd w:fill="FFFDF8" w:color="auto" w:val="clear"/>
-            <w:tcMar>
-              <w:top w:type="dxa" w:w="60"/>
-              <w:left w:type="dxa" w:w="90"/>
-              <w:bottom w:type="dxa" w:w="60"/>
-              <w:right w:type="dxa" w:w="90"/>
-            </w:tcMar>
-          </w:tcPr>
-          <w:p>
-            <w:pPr>
-              <w:spacing w:after="0"/>
-            </w:pPr>
-            <w:r>
-              <w:rPr>
-                <w:rFonts w:ascii="Calibri" w:cs="Calibri" w:eastAsia="Calibri" w:hAnsi="Calibri"/>
-                <w:b w:val="false"/>
-                <w:bCs w:val="false"/>
-                <w:i w:val="false"/>
-                <w:iCs w:val="false"/>
-                <w:color w:val="262626"/>
-                <w:sz w:val="16"/>
-                <w:szCs w:val="16"/>
-              </w:rPr>
-              <w:t xml:space="preserve">4 — One of the three answered thinly.</w:t>
-            </w:r>
-          </w:p>
-        </w:tc>
-        <w:tc>
-          <w:tcPr>
-            <w:tcW w:type="dxa" w:w="0"/>
-            <w:shd w:fill="FFFDF8" w:color="auto" w:val="clear"/>
-            <w:tcMar>
-              <w:top w:type="dxa" w:w="60"/>
-              <w:left w:type="dxa" w:w="90"/>
-              <w:bottom w:type="dxa" w:w="60"/>
-              <w:right w:type="dxa" w:w="90"/>
-            </w:tcMar>
-          </w:tcPr>
-          <w:p>
-            <w:pPr>
-              <w:spacing w:after="0"/>
-            </w:pPr>
-            <w:r>
-              <w:rPr>
-                <w:rFonts w:ascii="Calibri" w:cs="Calibri" w:eastAsia="Calibri" w:hAnsi="Calibri"/>
-                <w:b w:val="false"/>
-                <w:bCs w:val="false"/>
-                <w:i w:val="false"/>
-                <w:iCs w:val="false"/>
-                <w:color w:val="262626"/>
-                <w:sz w:val="16"/>
-                <w:szCs w:val="16"/>
-              </w:rPr>
-              <w:t xml:space="preserve">2 — Answered as a bare list, or one of the three skipped.</w:t>
-            </w:r>
-          </w:p>
-        </w:tc>
-        <w:tc>
-          <w:tcPr>
-            <w:tcW w:type="dxa" w:w="0"/>
-            <w:shd w:fill="FFFDF8" w:color="auto" w:val="clear"/>
-            <w:tcMar>
-              <w:top w:type="dxa" w:w="60"/>
-              <w:left w:type="dxa" w:w="90"/>
-              <w:bottom w:type="dxa" w:w="60"/>
-              <w:right w:type="dxa" w:w="90"/>
-            </w:tcMar>
-          </w:tcPr>
-          <w:p>
-            <w:pPr>
-              <w:spacing w:after="0"/>
-            </w:pPr>
-            <w:r>
-              <w:rPr>
-                <w:rFonts w:ascii="Calibri" w:cs="Calibri" w:eastAsia="Calibri" w:hAnsi="Calibri"/>
-                <w:b w:val="false"/>
-                <w:bCs w:val="false"/>
-                <w:i w:val="false"/>
-                <w:iCs w:val="false"/>
-                <w:color w:val="262626"/>
-                <w:sz w:val="16"/>
-                <w:szCs w:val="16"/>
-              </w:rPr>
-              <w:t xml:space="preserve">0 — Not answered.</w:t>
+              <w:t>5 — All three Additional Questions (AQ1–AQ3) answered in paragraphs, in a dedicated section.</w:t>
+            </w:r>
+          </w:p>
+        </w:tc>
+        <w:tc>
+          <w:tcPr>
+            <w:tcW w:type="dxa" w:w="0"/>
+            <w:shd w:fill="FFFDF8" w:color="auto" w:val="clear"/>
+            <w:tcMar>
+              <w:top w:type="dxa" w:w="60"/>
+              <w:left w:type="dxa" w:w="90"/>
+              <w:bottom w:type="dxa" w:w="60"/>
+              <w:right w:type="dxa" w:w="90"/>
+            </w:tcMar>
+          </w:tcPr>
+          <w:p>
+            <w:pPr>
+              <w:spacing w:after="0"/>
+            </w:pPr>
+            <w:r>
+              <w:rPr>
+                <w:rFonts w:ascii="Calibri" w:cs="Calibri" w:eastAsia="Calibri" w:hAnsi="Calibri"/>
+                <w:b w:val="false"/>
+                <w:bCs w:val="false"/>
+                <w:i w:val="false"/>
+                <w:iCs w:val="false"/>
+                <w:color w:val="262626"/>
+                <w:sz w:val="16"/>
+                <w:szCs w:val="16"/>
+              </w:rPr>
+              <w:t>4 — One of the three answered thinly.</w:t>
+            </w:r>
+          </w:p>
+        </w:tc>
+        <w:tc>
+          <w:tcPr>
+            <w:tcW w:type="dxa" w:w="0"/>
+            <w:shd w:fill="FFFDF8" w:color="auto" w:val="clear"/>
+            <w:tcMar>
+              <w:top w:type="dxa" w:w="60"/>
+              <w:left w:type="dxa" w:w="90"/>
+              <w:bottom w:type="dxa" w:w="60"/>
+              <w:right w:type="dxa" w:w="90"/>
+            </w:tcMar>
+          </w:tcPr>
+          <w:p>
+            <w:pPr>
+              <w:spacing w:after="0"/>
+            </w:pPr>
+            <w:r>
+              <w:rPr>
+                <w:rFonts w:ascii="Calibri" w:cs="Calibri" w:eastAsia="Calibri" w:hAnsi="Calibri"/>
+                <w:b w:val="false"/>
+                <w:bCs w:val="false"/>
+                <w:i w:val="false"/>
+                <w:iCs w:val="false"/>
+                <w:color w:val="262626"/>
+                <w:sz w:val="16"/>
+                <w:szCs w:val="16"/>
+              </w:rPr>
+              <w:t>3 — Answered inside another section rather than under their own heading.</w:t>
+            </w:r>
+          </w:p>
+        </w:tc>
+        <w:tc>
+          <w:tcPr>
+            <w:tcW w:type="dxa" w:w="0"/>
+            <w:shd w:fill="FFFDF8" w:color="auto" w:val="clear"/>
+            <w:tcMar>
+              <w:top w:type="dxa" w:w="60"/>
+              <w:left w:type="dxa" w:w="90"/>
+              <w:bottom w:type="dxa" w:w="60"/>
+              <w:right w:type="dxa" w:w="90"/>
+            </w:tcMar>
+          </w:tcPr>
+          <w:p>
+            <w:pPr>
+              <w:spacing w:after="0"/>
+            </w:pPr>
+            <w:r>
+              <w:rPr>
+                <w:rFonts w:ascii="Calibri" w:cs="Calibri" w:eastAsia="Calibri" w:hAnsi="Calibri"/>
+                <w:b w:val="false"/>
+                <w:bCs w:val="false"/>
+                <w:i w:val="false"/>
+                <w:iCs w:val="false"/>
+                <w:color w:val="262626"/>
+                <w:sz w:val="16"/>
+                <w:szCs w:val="16"/>
+              </w:rPr>
+              <w:t>2 — Answered as a bare list, or one of the three skipped.</w:t>
+            </w:r>
+          </w:p>
+        </w:tc>
+        <w:tc>
+          <w:tcPr>
+            <w:tcW w:type="dxa" w:w="1512"/>
+          </w:tcPr>
+          <w:p>
+            <w:r>
+              <w:t>0 — Not answered.</w:t>
             </w:r>
           </w:p>
         </w:tc>
@@ -2162,94 +2273,104 @@
                 <w:sz w:val="16"/>
                 <w:szCs w:val="16"/>
               </w:rPr>
-              <w:t xml:space="preserve">5 — Three to four sentences: numerical result with percent difference, a definitive verified / not-verified statement, and one concrete improvement to the measurement.</w:t>
-            </w:r>
-          </w:p>
-        </w:tc>
-        <w:tc>
-          <w:tcPr>
-            <w:tcW w:type="dxa" w:w="0"/>
-            <w:tcMar>
-              <w:top w:type="dxa" w:w="60"/>
-              <w:left w:type="dxa" w:w="90"/>
-              <w:bottom w:type="dxa" w:w="60"/>
-              <w:right w:type="dxa" w:w="90"/>
-            </w:tcMar>
-          </w:tcPr>
-          <w:p>
-            <w:pPr>
-              <w:spacing w:after="0"/>
-            </w:pPr>
-            <w:r>
-              <w:rPr>
-                <w:rFonts w:ascii="Calibri" w:cs="Calibri" w:eastAsia="Calibri" w:hAnsi="Calibri"/>
-                <w:b w:val="false"/>
-                <w:bCs w:val="false"/>
-                <w:i w:val="false"/>
-                <w:iCs w:val="false"/>
-                <w:color w:val="262626"/>
-                <w:sz w:val="16"/>
-                <w:szCs w:val="16"/>
-              </w:rPr>
-              <w:t xml:space="preserve">4 — Present but missing the numbers or the verdict.</w:t>
-            </w:r>
-          </w:p>
-        </w:tc>
-        <w:tc>
-          <w:tcPr>
-            <w:tcW w:type="dxa" w:w="0"/>
-            <w:tcMar>
-              <w:top w:type="dxa" w:w="60"/>
-              <w:left w:type="dxa" w:w="90"/>
-              <w:bottom w:type="dxa" w:w="60"/>
-              <w:right w:type="dxa" w:w="90"/>
-            </w:tcMar>
-          </w:tcPr>
-          <w:p>
-            <w:pPr>
-              <w:spacing w:after="0"/>
-            </w:pPr>
-            <w:r>
-              <w:rPr>
-                <w:rFonts w:ascii="Calibri" w:cs="Calibri" w:eastAsia="Calibri" w:hAnsi="Calibri"/>
-                <w:b w:val="false"/>
-                <w:bCs w:val="false"/>
-                <w:i w:val="false"/>
-                <w:iCs w:val="false"/>
-                <w:color w:val="262626"/>
-                <w:sz w:val="16"/>
-                <w:szCs w:val="16"/>
-              </w:rPr>
-              <w:t xml:space="preserve">2 — Present but vague, or a repeat of the discussion.</w:t>
-            </w:r>
-          </w:p>
-        </w:tc>
-        <w:tc>
-          <w:tcPr>
-            <w:tcW w:type="dxa" w:w="0"/>
-            <w:tcMar>
-              <w:top w:type="dxa" w:w="60"/>
-              <w:left w:type="dxa" w:w="90"/>
-              <w:bottom w:type="dxa" w:w="60"/>
-              <w:right w:type="dxa" w:w="90"/>
-            </w:tcMar>
-          </w:tcPr>
-          <w:p>
-            <w:pPr>
-              <w:spacing w:after="0"/>
-            </w:pPr>
-            <w:r>
-              <w:rPr>
-                <w:rFonts w:ascii="Calibri" w:cs="Calibri" w:eastAsia="Calibri" w:hAnsi="Calibri"/>
-                <w:b w:val="false"/>
-                <w:bCs w:val="false"/>
-                <w:i w:val="false"/>
-                <w:iCs w:val="false"/>
-                <w:color w:val="262626"/>
-                <w:sz w:val="16"/>
-                <w:szCs w:val="16"/>
-              </w:rPr>
-              <w:t xml:space="preserve">0 — No conclusion.</w:t>
+              <w:t>5 — Three to four sentences: numerical result with percent difference, a definitive verified / not-verified statement, and one concrete improvement to the measurement.</w:t>
+            </w:r>
+          </w:p>
+        </w:tc>
+        <w:tc>
+          <w:tcPr>
+            <w:tcW w:type="dxa" w:w="0"/>
+            <w:tcMar>
+              <w:top w:type="dxa" w:w="60"/>
+              <w:left w:type="dxa" w:w="90"/>
+              <w:bottom w:type="dxa" w:w="60"/>
+              <w:right w:type="dxa" w:w="90"/>
+            </w:tcMar>
+          </w:tcPr>
+          <w:p>
+            <w:pPr>
+              <w:spacing w:after="0"/>
+            </w:pPr>
+            <w:r>
+              <w:rPr>
+                <w:rFonts w:ascii="Calibri" w:cs="Calibri" w:eastAsia="Calibri" w:hAnsi="Calibri"/>
+                <w:b w:val="false"/>
+                <w:bCs w:val="false"/>
+                <w:i w:val="false"/>
+                <w:iCs w:val="false"/>
+                <w:color w:val="262626"/>
+                <w:sz w:val="16"/>
+                <w:szCs w:val="16"/>
+              </w:rPr>
+              <w:t>4 — Present but missing the numbers or the verdict.</w:t>
+            </w:r>
+          </w:p>
+        </w:tc>
+        <w:tc>
+          <w:tcPr>
+            <w:tcW w:type="dxa" w:w="0"/>
+            <w:tcMar>
+              <w:top w:type="dxa" w:w="60"/>
+              <w:left w:type="dxa" w:w="90"/>
+              <w:bottom w:type="dxa" w:w="60"/>
+              <w:right w:type="dxa" w:w="90"/>
+            </w:tcMar>
+          </w:tcPr>
+          <w:p>
+            <w:pPr>
+              <w:spacing w:after="0"/>
+            </w:pPr>
+            <w:r>
+              <w:rPr>
+                <w:rFonts w:ascii="Calibri" w:cs="Calibri" w:eastAsia="Calibri" w:hAnsi="Calibri"/>
+                <w:b w:val="false"/>
+                <w:bCs w:val="false"/>
+                <w:i w:val="false"/>
+                <w:iCs w:val="false"/>
+                <w:color w:val="262626"/>
+                <w:sz w:val="16"/>
+                <w:szCs w:val="16"/>
+              </w:rPr>
+              <w:t>3 — Present with the numbers but no definitive verified / not-verified verdict, or no improvement named.</w:t>
+            </w:r>
+          </w:p>
+        </w:tc>
+        <w:tc>
+          <w:tcPr>
+            <w:tcW w:type="dxa" w:w="0"/>
+            <w:tcMar>
+              <w:top w:type="dxa" w:w="60"/>
+              <w:left w:type="dxa" w:w="90"/>
+              <w:bottom w:type="dxa" w:w="60"/>
+              <w:right w:type="dxa" w:w="90"/>
+            </w:tcMar>
+          </w:tcPr>
+          <w:p>
+            <w:pPr>
+              <w:spacing w:after="0"/>
+            </w:pPr>
+            <w:r>
+              <w:rPr>
+                <w:rFonts w:ascii="Calibri" w:cs="Calibri" w:eastAsia="Calibri" w:hAnsi="Calibri"/>
+                <w:b w:val="false"/>
+                <w:bCs w:val="false"/>
+                <w:i w:val="false"/>
+                <w:iCs w:val="false"/>
+                <w:color w:val="262626"/>
+                <w:sz w:val="16"/>
+                <w:szCs w:val="16"/>
+              </w:rPr>
+              <w:t>2 — Present but vague, or a repeat of the discussion.</w:t>
+            </w:r>
+          </w:p>
+        </w:tc>
+        <w:tc>
+          <w:tcPr>
+            <w:tcW w:type="dxa" w:w="1512"/>
+          </w:tcPr>
+          <w:p>
+            <w:r>
+              <w:t>0 — No conclusion.</w:t>
             </w:r>
           </w:p>
         </w:tc>
@@ -2342,97 +2463,107 @@
                 <w:sz w:val="16"/>
                 <w:szCs w:val="16"/>
               </w:rPr>
-              <w:t xml:space="preserve">5 — At least one source beyond the textbook; author, title and date given for each.</w:t>
-            </w:r>
-          </w:p>
-        </w:tc>
-        <w:tc>
-          <w:tcPr>
-            <w:tcW w:type="dxa" w:w="0"/>
-            <w:shd w:fill="FFFDF8" w:color="auto" w:val="clear"/>
-            <w:tcMar>
-              <w:top w:type="dxa" w:w="60"/>
-              <w:left w:type="dxa" w:w="90"/>
-              <w:bottom w:type="dxa" w:w="60"/>
-              <w:right w:type="dxa" w:w="90"/>
-            </w:tcMar>
-          </w:tcPr>
-          <w:p>
-            <w:pPr>
-              <w:spacing w:after="0"/>
-            </w:pPr>
-            <w:r>
-              <w:rPr>
-                <w:rFonts w:ascii="Calibri" w:cs="Calibri" w:eastAsia="Calibri" w:hAnsi="Calibri"/>
-                <w:b w:val="false"/>
-                <w:bCs w:val="false"/>
-                <w:i w:val="false"/>
-                <w:iCs w:val="false"/>
-                <w:color w:val="262626"/>
-                <w:sz w:val="16"/>
-                <w:szCs w:val="16"/>
-              </w:rPr>
-              <w:t xml:space="preserve">4 — Multiple references but formatting incomplete.</w:t>
-            </w:r>
-          </w:p>
-        </w:tc>
-        <w:tc>
-          <w:tcPr>
-            <w:tcW w:type="dxa" w:w="0"/>
-            <w:shd w:fill="FFFDF8" w:color="auto" w:val="clear"/>
-            <w:tcMar>
-              <w:top w:type="dxa" w:w="60"/>
-              <w:left w:type="dxa" w:w="90"/>
-              <w:bottom w:type="dxa" w:w="60"/>
-              <w:right w:type="dxa" w:w="90"/>
-            </w:tcMar>
-          </w:tcPr>
-          <w:p>
-            <w:pPr>
-              <w:spacing w:after="0"/>
-            </w:pPr>
-            <w:r>
-              <w:rPr>
-                <w:rFonts w:ascii="Calibri" w:cs="Calibri" w:eastAsia="Calibri" w:hAnsi="Calibri"/>
-                <w:b w:val="false"/>
-                <w:bCs w:val="false"/>
-                <w:i w:val="false"/>
-                <w:iCs w:val="false"/>
-                <w:color w:val="262626"/>
-                <w:sz w:val="16"/>
-                <w:szCs w:val="16"/>
-              </w:rPr>
-              <w:t xml:space="preserve">2 — Handout only.</w:t>
-            </w:r>
-          </w:p>
-        </w:tc>
-        <w:tc>
-          <w:tcPr>
-            <w:tcW w:type="dxa" w:w="0"/>
-            <w:shd w:fill="FFFDF8" w:color="auto" w:val="clear"/>
-            <w:tcMar>
-              <w:top w:type="dxa" w:w="60"/>
-              <w:left w:type="dxa" w:w="90"/>
-              <w:bottom w:type="dxa" w:w="60"/>
-              <w:right w:type="dxa" w:w="90"/>
-            </w:tcMar>
-          </w:tcPr>
-          <w:p>
-            <w:pPr>
-              <w:spacing w:after="0"/>
-            </w:pPr>
-            <w:r>
-              <w:rPr>
-                <w:rFonts w:ascii="Calibri" w:cs="Calibri" w:eastAsia="Calibri" w:hAnsi="Calibri"/>
-                <w:b w:val="false"/>
-                <w:bCs w:val="false"/>
-                <w:i w:val="false"/>
-                <w:iCs w:val="false"/>
-                <w:color w:val="262626"/>
-                <w:sz w:val="16"/>
-                <w:szCs w:val="16"/>
-              </w:rPr>
-              <w:t xml:space="preserve">0 — No references.</w:t>
+              <w:t>5 — At least one source beyond the textbook; author, title and date given for each.</w:t>
+            </w:r>
+          </w:p>
+        </w:tc>
+        <w:tc>
+          <w:tcPr>
+            <w:tcW w:type="dxa" w:w="0"/>
+            <w:shd w:fill="FFFDF8" w:color="auto" w:val="clear"/>
+            <w:tcMar>
+              <w:top w:type="dxa" w:w="60"/>
+              <w:left w:type="dxa" w:w="90"/>
+              <w:bottom w:type="dxa" w:w="60"/>
+              <w:right w:type="dxa" w:w="90"/>
+            </w:tcMar>
+          </w:tcPr>
+          <w:p>
+            <w:pPr>
+              <w:spacing w:after="0"/>
+            </w:pPr>
+            <w:r>
+              <w:rPr>
+                <w:rFonts w:ascii="Calibri" w:cs="Calibri" w:eastAsia="Calibri" w:hAnsi="Calibri"/>
+                <w:b w:val="false"/>
+                <w:bCs w:val="false"/>
+                <w:i w:val="false"/>
+                <w:iCs w:val="false"/>
+                <w:color w:val="262626"/>
+                <w:sz w:val="16"/>
+                <w:szCs w:val="16"/>
+              </w:rPr>
+              <w:t>4 — Multiple references but formatting incomplete.</w:t>
+            </w:r>
+          </w:p>
+        </w:tc>
+        <w:tc>
+          <w:tcPr>
+            <w:tcW w:type="dxa" w:w="0"/>
+            <w:shd w:fill="FFFDF8" w:color="auto" w:val="clear"/>
+            <w:tcMar>
+              <w:top w:type="dxa" w:w="60"/>
+              <w:left w:type="dxa" w:w="90"/>
+              <w:bottom w:type="dxa" w:w="60"/>
+              <w:right w:type="dxa" w:w="90"/>
+            </w:tcMar>
+          </w:tcPr>
+          <w:p>
+            <w:pPr>
+              <w:spacing w:after="0"/>
+            </w:pPr>
+            <w:r>
+              <w:rPr>
+                <w:rFonts w:ascii="Calibri" w:cs="Calibri" w:eastAsia="Calibri" w:hAnsi="Calibri"/>
+                <w:b w:val="false"/>
+                <w:bCs w:val="false"/>
+                <w:i w:val="false"/>
+                <w:iCs w:val="false"/>
+                <w:color w:val="262626"/>
+                <w:sz w:val="16"/>
+                <w:szCs w:val="16"/>
+              </w:rPr>
+              <w:t>3 — Textbook and handout only, properly formatted.</w:t>
+            </w:r>
+          </w:p>
+        </w:tc>
+        <w:tc>
+          <w:tcPr>
+            <w:tcW w:type="dxa" w:w="0"/>
+            <w:shd w:fill="FFFDF8" w:color="auto" w:val="clear"/>
+            <w:tcMar>
+              <w:top w:type="dxa" w:w="60"/>
+              <w:left w:type="dxa" w:w="90"/>
+              <w:bottom w:type="dxa" w:w="60"/>
+              <w:right w:type="dxa" w:w="90"/>
+            </w:tcMar>
+          </w:tcPr>
+          <w:p>
+            <w:pPr>
+              <w:spacing w:after="0"/>
+            </w:pPr>
+            <w:r>
+              <w:rPr>
+                <w:rFonts w:ascii="Calibri" w:cs="Calibri" w:eastAsia="Calibri" w:hAnsi="Calibri"/>
+                <w:b w:val="false"/>
+                <w:bCs w:val="false"/>
+                <w:i w:val="false"/>
+                <w:iCs w:val="false"/>
+                <w:color w:val="262626"/>
+                <w:sz w:val="16"/>
+                <w:szCs w:val="16"/>
+              </w:rPr>
+              <w:t>2 — Handout only.</w:t>
+            </w:r>
+          </w:p>
+        </w:tc>
+        <w:tc>
+          <w:tcPr>
+            <w:tcW w:type="dxa" w:w="1512"/>
+          </w:tcPr>
+          <w:p>
+            <w:r>
+              <w:t>0 — No references.</w:t>
             </w:r>
           </w:p>
         </w:tc>
@@ -2585,7 +2716,6 @@
                 <w:sz w:val="16"/>
                 <w:szCs w:val="16"/>
               </w:rPr>
-              <w:t xml:space="preserve"/>
             </w:r>
           </w:p>
         </w:tc>
@@ -2615,8 +2745,15 @@
                 <w:sz w:val="16"/>
                 <w:szCs w:val="16"/>
               </w:rPr>
-              <w:t xml:space="preserve"/>
-            </w:r>
+            </w:r>
+          </w:p>
+        </w:tc>
+        <w:tc>
+          <w:tcPr>
+            <w:tcW w:type="dxa" w:w="1512"/>
+          </w:tcPr>
+          <w:p>
+            <w:r/>
           </w:p>
         </w:tc>
       </w:tr>

</xml_diff>